<commit_message>
chốt thay đổi tempalte và. thêm người đại diện kiểm kho
</commit_message>
<xml_diff>
--- a/my_custom_addons/dl_wood_traceability/static/TEMPLATES/TEMPLATE_BBBG.docx
+++ b/my_custom_addons/dl_wood_traceability/static/TEMPLATES/TEMPLATE_BBBG.docx
@@ -351,7 +351,42 @@
           <w:sz w:val="26"/>
           <w:szCs w:val="26"/>
         </w:rPr>
-        <w:t>{{company_representative}}</w:t>
+        <w:t xml:space="preserve"> </w:t>
+      </w:r>
+      <w:r>
+        <w:rPr>
+          <w:sz w:val="26"/>
+          <w:szCs w:val="26"/>
+        </w:rPr>
+        <w:t>{{</w:t>
+      </w:r>
+      <w:r>
+        <w:rPr>
+          <w:sz w:val="26"/>
+          <w:szCs w:val="26"/>
+        </w:rPr>
+        <w:t>inventory</w:t>
+      </w:r>
+      <w:r>
+        <w:rPr>
+          <w:sz w:val="26"/>
+          <w:szCs w:val="26"/>
+        </w:rPr>
+        <w:t>_</w:t>
+      </w:r>
+      <w:r>
+        <w:rPr>
+          <w:sz w:val="26"/>
+          <w:szCs w:val="26"/>
+        </w:rPr>
+        <w:t>clerk</w:t>
+      </w:r>
+      <w:r>
+        <w:rPr>
+          <w:sz w:val="26"/>
+          <w:szCs w:val="26"/>
+        </w:rPr>
+        <w:t>}}</w:t>
       </w:r>
       <w:r>
         <w:rPr>
@@ -365,7 +400,35 @@
           <w:sz w:val="26"/>
           <w:szCs w:val="26"/>
         </w:rPr>
-        <w:t>{{company_representative_position}}</w:t>
+        <w:t>{{</w:t>
+      </w:r>
+      <w:r>
+        <w:rPr>
+          <w:sz w:val="26"/>
+          <w:szCs w:val="26"/>
+        </w:rPr>
+        <w:t>inventory</w:t>
+      </w:r>
+      <w:r>
+        <w:rPr>
+          <w:sz w:val="26"/>
+          <w:szCs w:val="26"/>
+        </w:rPr>
+        <w:t>_</w:t>
+      </w:r>
+      <w:r>
+        <w:rPr>
+          <w:sz w:val="26"/>
+          <w:szCs w:val="26"/>
+        </w:rPr>
+        <w:t>clerk</w:t>
+      </w:r>
+      <w:r>
+        <w:rPr>
+          <w:sz w:val="26"/>
+          <w:szCs w:val="26"/>
+        </w:rPr>
+        <w:t>_position}}</w:t>
       </w:r>
     </w:p>
     <w:p>
@@ -485,7 +548,7 @@
                 <w:sz w:val="26"/>
                 <w:szCs w:val="26"/>
               </w:rPr>
-              <w:t>Số lượng</w:t>
+              <w:t>Khối lượng</w:t>
             </w:r>
           </w:p>
         </w:tc>

</xml_diff>

<commit_message>
commit chưc năng quét cccd
</commit_message>
<xml_diff>
--- a/my_custom_addons/dl_wood_traceability/static/TEMPLATES/TEMPLATE_BBBG.docx
+++ b/my_custom_addons/dl_wood_traceability/static/TEMPLATES/TEMPLATE_BBBG.docx
@@ -243,6 +243,13 @@
           <w:sz w:val="26"/>
           <w:szCs w:val="26"/>
         </w:rPr>
+        <w:t xml:space="preserve"> </w:t>
+      </w:r>
+      <w:r>
+        <w:rPr>
+          <w:sz w:val="26"/>
+          <w:szCs w:val="26"/>
+        </w:rPr>
         <w:t>{{forest_owner_cccd}}</w:t>
       </w:r>
       <w:r>
@@ -251,6 +258,13 @@
           <w:szCs w:val="26"/>
         </w:rPr>
         <w:t xml:space="preserve">   Ngày cấp:</w:t>
+      </w:r>
+      <w:r>
+        <w:rPr>
+          <w:sz w:val="26"/>
+          <w:szCs w:val="26"/>
+        </w:rPr>
+        <w:t xml:space="preserve"> </w:t>
       </w:r>
       <w:r>
         <w:rPr>
@@ -633,6 +647,7 @@
         <w:tc>
           <w:tcPr>
             <w:tcW w:w="0" w:type="auto"/>
+            <w:vAlign w:val="center"/>
           </w:tcPr>
           <w:p>
             <w:pPr>
@@ -719,6 +734,7 @@
         <w:tc>
           <w:tcPr>
             <w:tcW w:w="0" w:type="auto"/>
+            <w:vAlign w:val="center"/>
           </w:tcPr>
           <w:p>
             <w:pPr>
@@ -813,6 +829,7 @@
         <w:tc>
           <w:tcPr>
             <w:tcW w:w="0" w:type="auto"/>
+            <w:vAlign w:val="center"/>
           </w:tcPr>
           <w:p>
             <w:pPr>

</xml_diff>

<commit_message>
chỉnh sửa template , thêm upload file cho hồ sơ gỗ
</commit_message>
<xml_diff>
--- a/my_custom_addons/dl_wood_traceability/static/TEMPLATES/TEMPLATE_BBBG.docx
+++ b/my_custom_addons/dl_wood_traceability/static/TEMPLATES/TEMPLATE_BBBG.docx
@@ -1156,7 +1156,25 @@
                 <w:sz w:val="26"/>
                 <w:szCs w:val="26"/>
               </w:rPr>
-              <w:t>{{company_representative}}</w:t>
+              <w:t>{{</w:t>
+            </w:r>
+            <w:r>
+              <w:rPr>
+                <w:b/>
+                <w:bCs/>
+                <w:sz w:val="26"/>
+                <w:szCs w:val="26"/>
+              </w:rPr>
+              <w:t>inventory_clerk</w:t>
+            </w:r>
+            <w:r>
+              <w:rPr>
+                <w:b/>
+                <w:bCs/>
+                <w:sz w:val="26"/>
+                <w:szCs w:val="26"/>
+              </w:rPr>
+              <w:t>}}</w:t>
             </w:r>
           </w:p>
         </w:tc>

</xml_diff>